<commit_message>
Fill DSS literature slots with Crossref-verified Decision Support Systems references
Co-Authored-By: Claude Sonnet 5.5 <noreply@anthropic.com>
Claude-Session: https://claude.ai/code/session_01Ac6H42VjpVF4dJt1z1jQbD
</commit_message>
<xml_diff>
--- a/dss_revision/DSS_manuscript_anonymized.docx
+++ b/dss_revision/DSS_manuscript_anonymized.docx
@@ -116,7 +116,7 @@
         <w:rPr>
           <w:i w:val="0"/>
         </w:rPr>
-        <w:t>A campaign manager planning a product launch, a public-health message, or a policy announcement faces a concrete choice: place the message with a few prominent accounts, or spread the same exposure thinly across many ordinary users. The choice involves more than which option yields more engagement. It involves what the decision maker values. A launch with a short attention window rewards speed, a brand that runs many campaigns may care mostly about expected reach, and a one-off announcement may call for an outcome that can be predicted in advance. Field experiments on this choice are expensive, can disturb the communities under study, and are hard to repeat, so decision makers rely on models and simulation to narrow the options before committing budget [DSS-REF: add Decision Support Systems papers on social media or viral marketing decision support and on seeding or influence maximization].</w:t>
+        <w:t>A campaign manager planning a product launch, a public-health message, or a policy announcement faces a concrete choice: place the message with a few prominent accounts, or spread the same exposure thinly across many ordinary users. The choice involves more than which option yields more engagement. It involves what the decision maker values. A launch with a short attention window rewards speed, a brand that runs many campaigns may care mostly about expected reach, and a one-off announcement may call for an outcome that can be predicted in advance. Field experiments on this choice are expensive, can disturb the communities under study, and are hard to repeat, so decision makers rely on models and simulation to narrow the options before committing budget (for support of word-of-mouth marketing and seed identification in this journal, see Li and Du, 2011; Bao and Chang, 2014; Monteserin and Amandi, 2015).</w:t>
       </w:r>
     </w:p>
     <w:p>
@@ -124,7 +124,7 @@
         <w:rPr>
           <w:i w:val="0"/>
         </w:rPr>
-        <w:t>Agent-based simulation has long served this purpose (Bonabeau, 2002; Rand and Rust, 2011), and large language models (LLMs) have renewed its appeal. LLM agents can be given personas and can read, write, and react to natural-language content, which promises behavioral richness that rule-based agents lack (Park et al., 2023; Gao et al., 2023; Törnberg et al., 2023). [DSS-REF: add work that applies LLM agents to influencer selection and campaign pre-testing, and Decision Support Systems work on LLM-based decision support, after checking each publication venue.]</w:t>
+        <w:t>Agent-based simulation has long served this purpose (Bonabeau, 2002; Rand and Rust, 2011), and large language models (LLMs) have renewed its appeal. LLM agents can be given personas and can read, write, and react to natural-language content, which promises behavioral richness that rule-based agents lack (Park et al., 2023; Gao et al., 2023; Törnberg et al., 2023). Zhang et al. (2024) use time-aware LLM agents to select influencers for advertising campaigns, and recent work in this journal applies LLMs to decision support tasks such as process model comprehension (Kourani et al., 2026) and narrative explanation (Martens et al., 2025).</w:t>
       </w:r>
     </w:p>
     <w:p>
@@ -193,9 +193,17 @@
       <w:r>
         <w:rPr>
           <w:i w:val="0"/>
+        </w:rPr>
+        <w:t>Decision Support Systems has published work on supporting marketing and diffusion decisions on social media. Li and Du (2011) and Bao and Chang (2014) propose frameworks for identifying opinion leaders and message disseminators for word-of-mouth marketing, and Monteserin and Amandi (2015) use social influence maximization to decide whom to persuade in a negotiation. Schramm et al. (2010) build an agent-based diffusion model with consumer and brand agents, and He et al. (2024) model the co-diffusion of competing memes in online social networks. Editorial and empirical work on firms' use of social media (Duan, 2013; Chang et al., 2018) shows the journal's interest in social media as a managerial domain. Two features of this work frame our study. First, support for the seeding decision largely takes the form of identifying whom to target or of modeling how content spreads, rather than pre-testing alternative seeding plans in a simulated population. Second, to our knowledge, this literature does not use LLM agents as simulated users, nor does it generate agent action times from a point process whose intensity depends on agent state; recent LLM papers in the journal address other tasks, namely process model comprehension (Kourani et al., 2026) and narrative explanation (Martens et al., 2025). Our simulator is intended to fill this gap, and we examine whether the timing assumption changes the decision it recommends.</w:t>
+      </w:r>
+    </w:p>
+    <w:p>
+      <w:r>
+        <w:rPr>
+          <w:i w:val="0"/>
           <w:highlight w:val="yellow"/>
         </w:rPr>
-        <w:t>[DSS-REF: This subsection should position the paper within Decision Support Systems literature on simulation-based and data-driven support for social media marketing, viral campaigns, and seed selection. No such papers were verified while drafting, so none are cited here; add them after reading the sources.]</w:t>
+        <w:t>[Author check: the descriptions of the cited Decision Support Systems papers rest on their titles and bibliographic records. Read each paper and adjust the wording before submission, and repeat the literature search for papers that may fit better.]</w:t>
       </w:r>
     </w:p>
     <w:p>
@@ -4767,6 +4775,15 @@
         <w:ind w:left="432" w:hanging="432"/>
       </w:pPr>
       <w:r>
+        <w:t>Bao, T., Chang, T.-L.S., 2014. Finding disseminators via electronic word of mouth message for effective marketing communications. Decis. Support Syst. 67, 21–29.</w:t>
+      </w:r>
+    </w:p>
+    <w:p>
+      <w:pPr>
+        <w:spacing w:line="240" w:lineRule="auto"/>
+        <w:ind w:left="432" w:hanging="432"/>
+      </w:pPr>
+      <w:r>
         <w:t>Barabási, A.-L., 2005. The origin of bursts and heavy tails in human dynamics. Nature 435 (7039), 207–211.</w:t>
       </w:r>
     </w:p>
@@ -4794,7 +4811,25 @@
         <w:ind w:left="432" w:hanging="432"/>
       </w:pPr>
       <w:r>
+        <w:t>Chang, H.-L., Chou, Y.-C., Wu, D.-Y., Wu, S.-C., 2018. Will firm's marketing efforts on owned social media payoff? A quasi-experimental analysis of tourism products. Decis. Support Syst. 107, 13–25.</w:t>
+      </w:r>
+    </w:p>
+    <w:p>
+      <w:pPr>
+        <w:spacing w:line="240" w:lineRule="auto"/>
+        <w:ind w:left="432" w:hanging="432"/>
+      </w:pPr>
+      <w:r>
         <w:t>Crane, R., Sornette, D., 2008. Robust dynamic classes revealed by measuring the response function of a social system. Proc. Natl. Acad. Sci. 105 (41), 15649–15653.</w:t>
+      </w:r>
+    </w:p>
+    <w:p>
+      <w:pPr>
+        <w:spacing w:line="240" w:lineRule="auto"/>
+        <w:ind w:left="432" w:hanging="432"/>
+      </w:pPr>
+      <w:r>
+        <w:t>Duan, W., 2013. Special issue on social media: an editorial introduction. Decis. Support Syst. 55, 861–862.</w:t>
       </w:r>
     </w:p>
     <w:p>
@@ -4830,7 +4865,25 @@
         <w:ind w:left="432" w:hanging="432"/>
       </w:pPr>
       <w:r>
+        <w:t>He, S., Zhang, W., Luo, J., Zhang, P., Zhao, K., Zeng, D.D., 2024. Modeling the co-diffusion of competing memes in online social networks. Decis. Support Syst. 187, 114324.</w:t>
+      </w:r>
+    </w:p>
+    <w:p>
+      <w:pPr>
+        <w:spacing w:line="240" w:lineRule="auto"/>
+        <w:ind w:left="432" w:hanging="432"/>
+      </w:pPr>
+      <w:r>
         <w:t>Kempe, D., Kleinberg, J., Tardos, É., 2003. Maximizing the spread of influence through a social network. In: Proceedings of the Ninth ACM SIGKDD International Conference on Knowledge Discovery and Data Mining. ACM, New York, pp. 137–146.</w:t>
+      </w:r>
+    </w:p>
+    <w:p>
+      <w:pPr>
+        <w:spacing w:line="240" w:lineRule="auto"/>
+        <w:ind w:left="432" w:hanging="432"/>
+      </w:pPr>
+      <w:r>
+        <w:t>Kourani, H., Berti, A., Hennrich, J., Kratsch, W., Weidlich, R., Li, C.-Y., Arslan, A., van der Aalst, W.M.P., Schuster, D., 2026. Leveraging large language models for enhanced process model comprehension. Decis. Support Syst. 200, 114563.</w:t>
       </w:r>
     </w:p>
     <w:p>
@@ -4848,7 +4901,34 @@
         <w:ind w:left="432" w:hanging="432"/>
       </w:pPr>
       <w:r>
+        <w:t>Li, F., Du, T.C., 2011. Who is talking? An ontology-based opinion leader identification framework for word-of-mouth marketing in online social blogs. Decis. Support Syst. 51, 190–197.</w:t>
+      </w:r>
+    </w:p>
+    <w:p>
+      <w:pPr>
+        <w:spacing w:line="240" w:lineRule="auto"/>
+        <w:ind w:left="432" w:hanging="432"/>
+      </w:pPr>
+      <w:r>
         <w:t>Malmgren, R.D., Stouffer, D.B., Motter, A.E., Amaral, L.A.N., 2008. A Poissonian explanation for heavy tails in e-mail communication. Proc. Natl. Acad. Sci. 105 (47), 18153–18158.</w:t>
+      </w:r>
+    </w:p>
+    <w:p>
+      <w:pPr>
+        <w:spacing w:line="240" w:lineRule="auto"/>
+        <w:ind w:left="432" w:hanging="432"/>
+      </w:pPr>
+      <w:r>
+        <w:t>Martens, D., Hinns, J., Dams, C., Vergouwen, M., Evgeniou, T., 2025. Tell me a story! Narrative-driven XAI with large language models. Decis. Support Syst. 191, 114402.</w:t>
+      </w:r>
+    </w:p>
+    <w:p>
+      <w:pPr>
+        <w:spacing w:line="240" w:lineRule="auto"/>
+        <w:ind w:left="432" w:hanging="432"/>
+      </w:pPr>
+      <w:r>
+        <w:t>Monteserin, A., Amandi, A., 2015. Whom should I persuade during a negotiation? An approach based on social influence maximization. Decis. Support Syst. 77, 1–20.</w:t>
       </w:r>
     </w:p>
     <w:p>
@@ -4884,6 +4964,15 @@
         <w:ind w:left="432" w:hanging="432"/>
       </w:pPr>
       <w:r>
+        <w:t>Schramm, M.E., Trainor, K.J., Shanker, M., Hu, M.Y., 2010. An agent-based diffusion model with consumer and brand agents. Decis. Support Syst. 50, 234–242.</w:t>
+      </w:r>
+    </w:p>
+    <w:p>
+      <w:pPr>
+        <w:spacing w:line="240" w:lineRule="auto"/>
+        <w:ind w:left="432" w:hanging="432"/>
+      </w:pPr>
+      <w:r>
         <w:t>Törnberg, P., Valeeva, D., Uitermark, J., Bail, C., 2023. Simulating social media using large language models to evaluate alternative news feed algorithms. arXiv:2310.05984.</w:t>
       </w:r>
     </w:p>
@@ -4894,6 +4983,15 @@
       </w:pPr>
       <w:r>
         <w:t>Watts, D.J., Dodds, P.S., 2007. Influentials, networks, and public opinion formation. J. Consum. Res. 34 (4), 441–458.</w:t>
+      </w:r>
+    </w:p>
+    <w:p>
+      <w:pPr>
+        <w:spacing w:line="240" w:lineRule="auto"/>
+        <w:ind w:left="432" w:hanging="432"/>
+      </w:pPr>
+      <w:r>
+        <w:t>Zhang, X., Chen, X., Liu, Y., Wang, J., Hu, Z., Yan, R., 2024. A large-scale time-aware agents simulation for influencer selection in digital advertising campaigns. arXiv:2411.01143.</w:t>
       </w:r>
     </w:p>
     <w:p>

</xml_diff>